<commit_message>
fix: harden managed privacy and document reproducible internal verification
</commit_message>
<xml_diff>
--- a/ai-policy-legal-practice-template.docx
+++ b/ai-policy-legal-practice-template.docx
@@ -62,6 +62,7 @@
       <w:tr>
         <w:trPr>
           <w:tblHeader/>
+          <w:cantSplit/>
         </w:trPr>
         <w:tc>
           <w:tcPr>
@@ -207,6 +208,7 @@
       <w:tr>
         <w:trPr>
           <w:tblHeader w:val="false"/>
+          <w:cantSplit/>
         </w:trPr>
         <w:tc>
           <w:tcPr>
@@ -348,6 +350,7 @@
       <w:tr>
         <w:trPr>
           <w:tblHeader w:val="false"/>
+          <w:cantSplit/>
         </w:trPr>
         <w:tc>
           <w:tcPr>
@@ -489,6 +492,7 @@
       <w:tr>
         <w:trPr>
           <w:tblHeader w:val="false"/>
+          <w:cantSplit/>
         </w:trPr>
         <w:tc>
           <w:tcPr>
@@ -630,6 +634,7 @@
       <w:tr>
         <w:trPr>
           <w:tblHeader w:val="false"/>
+          <w:cantSplit/>
         </w:trPr>
         <w:tc>
           <w:tcPr>
@@ -771,6 +776,7 @@
       <w:tr>
         <w:trPr>
           <w:tblHeader w:val="false"/>
+          <w:cantSplit/>
         </w:trPr>
         <w:tc>
           <w:tcPr>
@@ -949,6 +955,7 @@
     </w:p>
     <w:p>
       <w:pPr>
+        <w:pageBreakBefore/>
         <w:spacing w:after="140" w:before="200"/>
       </w:pPr>
       <w:r>
@@ -5366,7 +5373,7 @@
           <w:sz w:val="21"/>
           <w:szCs w:val="21"/>
         </w:rPr>
-        <w:t xml:space="preserve">A supplier retention period is not of itself publication, and it is not training. On that construction, which follows from the text of the instrument but has not been the subject of decision, the absence of a zero retention arrangement does not prevent satisfaction under clause 8.3, and on some subscription tiers such an arrangement is not offered at all. Where it is unavailable, satisfaction rests on three things instead: the contractual term that inputs and outputs are not used to train any model and are not made publicly available, the closure of every channel that retains material for longer than the ordinary session, and the practice being able to show from its own records that material was sent, when, by whom and to which endpoint. Where the content itself must be recoverable, that record is made under clause 17 on the matter file, or by configuring the practice's telemetry to retain content, and Schedule 8 records which applies to each application. Part E of that schedule records the consequences of the tier the practice holds.</w:t>
+        <w:t>A supplier retention period is not of itself publication, and it is not training. On that construction, which follows from the text of the instrument but has not been the subject of decision, the absence of a zero retention arrangement does not prevent satisfaction under clause 8.3, and on some subscription tiers such an arrangement is not offered at all. Where it is unavailable, satisfaction rests on three things instead: the contractual term that inputs and outputs are not used to train any model and are not made publicly available, the closure of every channel that retains material for longer than the ordinary session, and the practice being able to show from its own records that material was sent, when, by whom and to which endpoint. Where the content itself must be recoverable, that record is made under clause 17 on the matter file, or by configuring the practice's telemetry to retain content, and Schedule 8 records which applies to each application. Part E of that schedule records the consequences of the tier the practice holds. This is an interpretive conclusion, not a supplier fact. The responsible principal must approve its application to the actual deployment and record that approval and its date in the tool evidence file before restricted information is used.</w:t>
       </w:r>
     </w:p>
     <w:p>
@@ -8420,7 +8427,7 @@
           <w:sz w:val="21"/>
           <w:szCs w:val="21"/>
         </w:rPr>
-        <w:t xml:space="preserve">The record required by this clause is the record made on the matter file. The local session cache and the practice's telemetry are operational records, are retained for shorter periods, and are not a substitute for it. Where an application is configured so that no automatic record of content is kept, that is noted in Schedule 8 against the application.</w:t>
+        <w:t>The record required by this clause is the record made on the matter file. The local session cache and the practice's telemetry are operational records, are retained for shorter periods, and are not a substitute for it. Where an application is configured so that no automatic record of content is kept, that is noted in Schedule 8 against the application. Where a session transcript is copied automatically into the matter folder, it is a convenience copy held with that matter's records and does not replace the structured record required by clause 17.2. The practice must verify successful filing before relying on the copy.</w:t>
       </w:r>
     </w:p>
     <w:p>
@@ -9569,6 +9576,7 @@
       <w:tr>
         <w:trPr>
           <w:tblHeader/>
+          <w:cantSplit/>
         </w:trPr>
         <w:tc>
           <w:tcPr>
@@ -9784,6 +9792,7 @@
       <w:tr>
         <w:trPr>
           <w:tblHeader w:val="false"/>
+          <w:cantSplit/>
         </w:trPr>
         <w:tc>
           <w:tcPr>
@@ -10095,6 +10104,7 @@
       <w:tr>
         <w:trPr>
           <w:tblHeader w:val="false"/>
+          <w:cantSplit/>
         </w:trPr>
         <w:tc>
           <w:tcPr>
@@ -10304,6 +10314,7 @@
       <w:tr>
         <w:trPr>
           <w:tblHeader w:val="false"/>
+          <w:cantSplit/>
         </w:trPr>
         <w:tc>
           <w:tcPr>
@@ -10613,6 +10624,7 @@
       <w:tr>
         <w:trPr>
           <w:tblHeader/>
+          <w:cantSplit/>
         </w:trPr>
         <w:tc>
           <w:tcPr>
@@ -10688,6 +10700,7 @@
       <w:tr>
         <w:trPr>
           <w:tblHeader w:val="false"/>
+          <w:cantSplit/>
         </w:trPr>
         <w:tc>
           <w:tcPr>
@@ -10761,6 +10774,7 @@
       <w:tr>
         <w:trPr>
           <w:tblHeader w:val="false"/>
+          <w:cantSplit/>
         </w:trPr>
         <w:tc>
           <w:tcPr>
@@ -10834,6 +10848,7 @@
       <w:tr>
         <w:trPr>
           <w:tblHeader w:val="false"/>
+          <w:cantSplit/>
         </w:trPr>
         <w:tc>
           <w:tcPr>
@@ -10907,6 +10922,7 @@
       <w:tr>
         <w:trPr>
           <w:tblHeader w:val="false"/>
+          <w:cantSplit/>
         </w:trPr>
         <w:tc>
           <w:tcPr>
@@ -10980,6 +10996,7 @@
       <w:tr>
         <w:trPr>
           <w:tblHeader w:val="false"/>
+          <w:cantSplit/>
         </w:trPr>
         <w:tc>
           <w:tcPr>
@@ -11053,6 +11070,7 @@
       <w:tr>
         <w:trPr>
           <w:tblHeader w:val="false"/>
+          <w:cantSplit/>
         </w:trPr>
         <w:tc>
           <w:tcPr>
@@ -11126,6 +11144,7 @@
       <w:tr>
         <w:trPr>
           <w:tblHeader w:val="false"/>
+          <w:cantSplit/>
         </w:trPr>
         <w:tc>
           <w:tcPr>
@@ -11199,6 +11218,7 @@
       <w:tr>
         <w:trPr>
           <w:tblHeader w:val="false"/>
+          <w:cantSplit/>
         </w:trPr>
         <w:tc>
           <w:tcPr>
@@ -11289,6 +11309,7 @@
       <w:tr>
         <w:trPr>
           <w:tblHeader w:val="false"/>
+          <w:cantSplit/>
         </w:trPr>
         <w:tc>
           <w:tcPr>
@@ -11362,6 +11383,7 @@
       <w:tr>
         <w:trPr>
           <w:tblHeader w:val="false"/>
+          <w:cantSplit/>
         </w:trPr>
         <w:tc>
           <w:tcPr>
@@ -11435,6 +11457,7 @@
       <w:tr>
         <w:trPr>
           <w:tblHeader w:val="false"/>
+          <w:cantSplit/>
         </w:trPr>
         <w:tc>
           <w:tcPr>
@@ -11508,6 +11531,7 @@
       <w:tr>
         <w:trPr>
           <w:tblHeader w:val="false"/>
+          <w:cantSplit/>
         </w:trPr>
         <w:tc>
           <w:tcPr>
@@ -12058,6 +12082,7 @@
       <w:tr>
         <w:trPr>
           <w:tblHeader/>
+          <w:cantSplit/>
         </w:trPr>
         <w:tc>
           <w:tcPr>
@@ -12133,6 +12158,7 @@
       <w:tr>
         <w:trPr>
           <w:tblHeader w:val="false"/>
+          <w:cantSplit/>
         </w:trPr>
         <w:tc>
           <w:tcPr>
@@ -12206,6 +12232,7 @@
       <w:tr>
         <w:trPr>
           <w:tblHeader w:val="false"/>
+          <w:cantSplit/>
         </w:trPr>
         <w:tc>
           <w:tcPr>
@@ -12296,6 +12323,7 @@
       <w:tr>
         <w:trPr>
           <w:tblHeader w:val="false"/>
+          <w:cantSplit/>
         </w:trPr>
         <w:tc>
           <w:tcPr>
@@ -12369,6 +12397,7 @@
       <w:tr>
         <w:trPr>
           <w:tblHeader w:val="false"/>
+          <w:cantSplit/>
         </w:trPr>
         <w:tc>
           <w:tcPr>
@@ -12442,6 +12471,7 @@
       <w:tr>
         <w:trPr>
           <w:tblHeader w:val="false"/>
+          <w:cantSplit/>
         </w:trPr>
         <w:tc>
           <w:tcPr>
@@ -12515,6 +12545,7 @@
       <w:tr>
         <w:trPr>
           <w:tblHeader w:val="false"/>
+          <w:cantSplit/>
         </w:trPr>
         <w:tc>
           <w:tcPr>
@@ -12622,6 +12653,7 @@
       <w:tr>
         <w:trPr>
           <w:tblHeader w:val="false"/>
+          <w:cantSplit/>
         </w:trPr>
         <w:tc>
           <w:tcPr>
@@ -12695,6 +12727,7 @@
       <w:tr>
         <w:trPr>
           <w:tblHeader w:val="false"/>
+          <w:cantSplit/>
         </w:trPr>
         <w:tc>
           <w:tcPr>
@@ -12768,6 +12801,7 @@
       <w:tr>
         <w:trPr>
           <w:tblHeader w:val="false"/>
+          <w:cantSplit/>
         </w:trPr>
         <w:tc>
           <w:tcPr>
@@ -12841,6 +12875,7 @@
       <w:tr>
         <w:trPr>
           <w:tblHeader w:val="false"/>
+          <w:cantSplit/>
         </w:trPr>
         <w:tc>
           <w:tcPr>
@@ -13000,6 +13035,7 @@
       <w:tr>
         <w:trPr>
           <w:tblHeader/>
+          <w:cantSplit/>
         </w:trPr>
         <w:tc>
           <w:tcPr>
@@ -13120,6 +13156,7 @@
       <w:tr>
         <w:trPr>
           <w:tblHeader w:val="false"/>
+          <w:cantSplit/>
         </w:trPr>
         <w:tc>
           <w:tcPr>
@@ -13239,6 +13276,7 @@
       <w:tr>
         <w:trPr>
           <w:tblHeader w:val="false"/>
+          <w:cantSplit/>
         </w:trPr>
         <w:tc>
           <w:tcPr>
@@ -13358,6 +13396,7 @@
       <w:tr>
         <w:trPr>
           <w:tblHeader w:val="false"/>
+          <w:cantSplit/>
         </w:trPr>
         <w:tc>
           <w:tcPr>
@@ -13477,6 +13516,7 @@
       <w:tr>
         <w:trPr>
           <w:tblHeader w:val="false"/>
+          <w:cantSplit/>
         </w:trPr>
         <w:tc>
           <w:tcPr>
@@ -13596,6 +13636,7 @@
       <w:tr>
         <w:trPr>
           <w:tblHeader w:val="false"/>
+          <w:cantSplit/>
         </w:trPr>
         <w:tc>
           <w:tcPr>
@@ -13715,6 +13756,7 @@
       <w:tr>
         <w:trPr>
           <w:tblHeader w:val="false"/>
+          <w:cantSplit/>
         </w:trPr>
         <w:tc>
           <w:tcPr>
@@ -13834,6 +13876,7 @@
       <w:tr>
         <w:trPr>
           <w:tblHeader w:val="false"/>
+          <w:cantSplit/>
         </w:trPr>
         <w:tc>
           <w:tcPr>
@@ -14056,6 +14099,7 @@
       <w:tr>
         <w:trPr>
           <w:tblHeader/>
+          <w:cantSplit/>
         </w:trPr>
         <w:tc>
           <w:tcPr>
@@ -14166,6 +14210,7 @@
       <w:tr>
         <w:trPr>
           <w:tblHeader w:val="false"/>
+          <w:cantSplit/>
         </w:trPr>
         <w:tc>
           <w:tcPr>
@@ -14273,6 +14318,7 @@
       <w:tr>
         <w:trPr>
           <w:tblHeader w:val="false"/>
+          <w:cantSplit/>
         </w:trPr>
         <w:tc>
           <w:tcPr>
@@ -14380,6 +14426,7 @@
       <w:tr>
         <w:trPr>
           <w:tblHeader w:val="false"/>
+          <w:cantSplit/>
         </w:trPr>
         <w:tc>
           <w:tcPr>
@@ -14487,6 +14534,7 @@
       <w:tr>
         <w:trPr>
           <w:tblHeader w:val="false"/>
+          <w:cantSplit/>
         </w:trPr>
         <w:tc>
           <w:tcPr>
@@ -14594,6 +14642,7 @@
       <w:tr>
         <w:trPr>
           <w:tblHeader w:val="false"/>
+          <w:cantSplit/>
         </w:trPr>
         <w:tc>
           <w:tcPr>
@@ -14701,6 +14750,7 @@
       <w:tr>
         <w:trPr>
           <w:tblHeader w:val="false"/>
+          <w:cantSplit/>
         </w:trPr>
         <w:tc>
           <w:tcPr>
@@ -14808,6 +14858,7 @@
       <w:tr>
         <w:trPr>
           <w:tblHeader w:val="false"/>
+          <w:cantSplit/>
         </w:trPr>
         <w:tc>
           <w:tcPr>
@@ -15239,6 +15290,7 @@
       <w:tr>
         <w:trPr>
           <w:tblHeader/>
+          <w:cantSplit/>
         </w:trPr>
         <w:tc>
           <w:tcPr>
@@ -15384,6 +15436,7 @@
       <w:tr>
         <w:trPr>
           <w:tblHeader w:val="false"/>
+          <w:cantSplit/>
         </w:trPr>
         <w:tc>
           <w:tcPr>
@@ -15576,6 +15629,7 @@
       <w:tr>
         <w:trPr>
           <w:tblHeader w:val="false"/>
+          <w:cantSplit/>
         </w:trPr>
         <w:tc>
           <w:tcPr>
@@ -15751,6 +15805,7 @@
       <w:tr>
         <w:trPr>
           <w:tblHeader w:val="false"/>
+          <w:cantSplit/>
         </w:trPr>
         <w:tc>
           <w:tcPr>
@@ -15909,6 +15964,7 @@
       <w:tr>
         <w:trPr>
           <w:tblHeader w:val="false"/>
+          <w:cantSplit/>
         </w:trPr>
         <w:tc>
           <w:tcPr>
@@ -16118,6 +16174,7 @@
       <w:tr>
         <w:trPr>
           <w:tblHeader w:val="false"/>
+          <w:cantSplit/>
         </w:trPr>
         <w:tc>
           <w:tcPr>
@@ -16367,6 +16424,7 @@
       <w:tr>
         <w:trPr>
           <w:tblHeader/>
+          <w:cantSplit/>
         </w:trPr>
         <w:tc>
           <w:tcPr>
@@ -16477,6 +16535,7 @@
       <w:tr>
         <w:trPr>
           <w:tblHeader w:val="false"/>
+          <w:cantSplit/>
         </w:trPr>
         <w:tc>
           <w:tcPr>
@@ -16601,6 +16660,7 @@
       <w:tr>
         <w:trPr>
           <w:tblHeader w:val="false"/>
+          <w:cantSplit/>
         </w:trPr>
         <w:tc>
           <w:tcPr>
@@ -16725,6 +16785,7 @@
       <w:tr>
         <w:trPr>
           <w:tblHeader w:val="false"/>
+          <w:cantSplit/>
         </w:trPr>
         <w:tc>
           <w:tcPr>
@@ -16849,6 +16910,7 @@
       <w:tr>
         <w:trPr>
           <w:tblHeader w:val="false"/>
+          <w:cantSplit/>
         </w:trPr>
         <w:tc>
           <w:tcPr>
@@ -17030,6 +17092,7 @@
       <w:tr>
         <w:trPr>
           <w:tblHeader/>
+          <w:cantSplit/>
         </w:trPr>
         <w:tc>
           <w:tcPr>
@@ -17140,6 +17203,7 @@
       <w:tr>
         <w:trPr>
           <w:tblHeader w:val="false"/>
+          <w:cantSplit/>
         </w:trPr>
         <w:tc>
           <w:tcPr>
@@ -17281,6 +17345,7 @@
       <w:tr>
         <w:trPr>
           <w:tblHeader w:val="false"/>
+          <w:cantSplit/>
         </w:trPr>
         <w:tc>
           <w:tcPr>
@@ -17405,6 +17470,7 @@
       <w:tr>
         <w:trPr>
           <w:tblHeader w:val="false"/>
+          <w:cantSplit/>
         </w:trPr>
         <w:tc>
           <w:tcPr>
@@ -17529,6 +17595,7 @@
       <w:tr>
         <w:trPr>
           <w:tblHeader w:val="false"/>
+          <w:cantSplit/>
         </w:trPr>
         <w:tc>
           <w:tcPr>
@@ -17726,6 +17793,7 @@
       <w:tr>
         <w:trPr>
           <w:tblHeader/>
+          <w:cantSplit/>
         </w:trPr>
         <w:tc>
           <w:tcPr>
@@ -17801,6 +17869,7 @@
       <w:tr>
         <w:trPr>
           <w:tblHeader w:val="false"/>
+          <w:cantSplit/>
         </w:trPr>
         <w:tc>
           <w:tcPr>
@@ -17891,6 +17960,7 @@
       <w:tr>
         <w:trPr>
           <w:tblHeader w:val="false"/>
+          <w:cantSplit/>
         </w:trPr>
         <w:tc>
           <w:tcPr>
@@ -17981,6 +18051,7 @@
       <w:tr>
         <w:trPr>
           <w:tblHeader w:val="false"/>
+          <w:cantSplit/>
         </w:trPr>
         <w:tc>
           <w:tcPr>
@@ -18071,6 +18142,7 @@
       <w:tr>
         <w:trPr>
           <w:tblHeader w:val="false"/>
+          <w:cantSplit/>
         </w:trPr>
         <w:tc>
           <w:tcPr>
@@ -18144,6 +18216,7 @@
       <w:tr>
         <w:trPr>
           <w:tblHeader w:val="false"/>
+          <w:cantSplit/>
         </w:trPr>
         <w:tc>
           <w:tcPr>
@@ -18284,7 +18357,7 @@
           <w:sz w:val="21"/>
           <w:szCs w:val="21"/>
         </w:rPr>
-        <w:t xml:space="preserve">The practice records here the subscription tier it holds for each application in Part A, because the tier governs what is available and what is not. The common case, and the premise on which the rest of this Part is written, is a business or team subscription on which a zero retention arrangement is not offered. On such a tier retention by the supplier is a fixed period, commonly thirty days, and cannot be shortened by configuration. This is recorded here rather than in the body of the policy because it changes if the practice changes tier.</w:t>
+        <w:t>This Part is a worked example of one deployment, not a statement of the adopting practice's arrangements. Replace the tier, endpoint, region, retention and logging facts against the executed agreement and the observed deployment before adoption. The practice records here the subscription tier it holds for each application in Part A, because the tier governs what is available and what is not. The common case, and the premise on which the rest of this Part is written, is a business or team subscription on which a zero retention arrangement is not offered. On such a tier retention by the supplier is a fixed period, commonly thirty days, and cannot be shortened by configuration. This is recorded here rather than in the body of the policy because it changes if the practice changes tier.</w:t>
       </w:r>
     </w:p>
     <w:p>
@@ -18360,7 +18433,7 @@
           <w:sz w:val="21"/>
           <w:szCs w:val="21"/>
         </w:rPr>
-        <w:t xml:space="preserve">Some surfaces are absent on a business or team subscription, which narrows the exposure rather than widening it. In the case of one widely used assistant, screen control, by which the tool operates the applications on a workstation directly, and the facility that dispatches work from a telephone to a session running on a desktop, are both unavailable on its team and enterprise subscriptions and require a personal subscription instead. Where a practice relies on the absence of a feature, the supplier's documentation stating it is held in the evidence file.</w:t>
+        <w:t>Feature availability, including computer control and remote sessions, varies by product, account and release. Do not treat a feature as absent on the strength of a plan name. Record the current supplier evidence and verify the administrator controls for the actual deployment before relying on a feature restriction.</w:t>
       </w:r>
     </w:p>
     <w:p>
@@ -18417,7 +18490,7 @@
           <w:sz w:val="21"/>
           <w:szCs w:val="21"/>
         </w:rPr>
-        <w:t xml:space="preserve">Non-essential traffic is disabled through CLAUDE_CODE_DISABLE_NONESSENTIAL_TRAFFIC, with DISABLE_TELEMETRY, DISABLE_ERROR_REPORTING, DISABLE_FEEDBACK_COMMAND and CLAUDE_CODE_DISABLE_FEEDBACK_SURVEY set individually so the position survives a change in what the first variable covers. The feedback, bug and share commands transmit conversation history including file contents and are retained for five years, and an accepted transcript share uploads the session log for up to six months; both channels must be closed.</w:t>
+        <w:t>The managed reference settings set CLAUDE_CODE_DISABLE_NONESSENTIAL_TRAFFIC, DISABLE_FEEDBACK_COMMAND and CLAUDE_CODE_DISABLE_FEEDBACK_SURVEY to 1. Metadata export to the approved collector is enabled separately. The personal convenience file also disables telemetry and error reporting and is not a substitute for managed deployment. Supplier-side retention and exceptions must be verified in the evidence file; client switches do not establish contractual retention.</w:t>
       </w:r>
     </w:p>
     <w:p>
@@ -18474,7 +18547,7 @@
           <w:sz w:val="21"/>
           <w:szCs w:val="21"/>
         </w:rPr>
-        <w:t xml:space="preserve">Telemetry to the practice collector is enabled through CLAUDE_CODE_ENABLE_TELEMETRY together with the exporter, endpoint and protocol variables. Content is gated separately and is redacted unless the gate is set: OTEL_LOG_USER_PROMPTS, OTEL_LOG_ASSISTANT_RESPONSES, OTEL_LOG_TOOL_DETAILS and OTEL_LOG_TOOL_CONTENT each govern a category. The practice leaves all four unset, so the collector evidences transmission and not content, and the content record is made under clause 17. Two features of those gates matter. The assistant response gate follows the prompt gate when it is left unset, so enabling prompt content also enables response content unless the response gate is expressly set to zero. And where sign-in is by OAuth the user email appears in telemetry attributes, which the collector's own retention must account for. If content logging is ever enabled, clause 17.4 applies to the collector.</w:t>
+        <w:t>Telemetry to the approved collector is enabled through CLAUDE_CODE_ENABLE_TELEMETRY together with exporter, base endpoint and protocol variables. The managed template explicitly sets OTEL_LOG_USER_PROMPTS, OTEL_LOG_ASSISTANT_RESPONSES, OTEL_LOG_TOOL_DETAILS, OTEL_LOG_TOOL_CONTENT and OTEL_LOG_RAW_API_BODIES to 0. Leaving these unset can inherit content logging from another source. The collector records metadata, not a verbatim conversation. OAuth identity attributes may still be present and must be covered by the collector's retention and access controls. CLAUDE_CODE_SUBPROCESS_ENV_SCRUB is enabled to reduce child-process credential exposure. Verify the actual emitted data after deployment; client configuration is not evidence of supplier retention.</w:t>
       </w:r>
     </w:p>
     <w:p>
@@ -18494,6 +18567,14 @@
           <w:szCs w:val="21"/>
         </w:rPr>
         <w:t xml:space="preserve">Where a zero retention arrangement is not available on the tier the practice holds, the settings in this Part are the whole of the control. The variables that disable the feedback, bug and share commands and the session survey must be in force before Claude Code is used on any client matter, and the practice's own OpenTelemetry collector must be configured, because between them they close the long-retention channels and supply the transmission record that nothing else on this tier provides. See Part E.</w:t>
+      </w:r>
+    </w:p>
+    <w:p>
+      <w:pPr>
+        <w:spacing w:after="100"/>
+      </w:pPr>
+      <w:r>
+        <w:t>The matter guard is a separate command hook in hooks/matter-guard.js. CLAUDE_MATTER_ROOTS identifies parent directories whose direct children are matters. The template uses warn mode for synthetic observation; rendered deployment settings require enforce mode. A session binds to one matter and SessionEnd copies its transcript to that matter's _ai-record folder unless an approved central record root is configured. The hook does not parse shell commands or replace operating-system isolation. Native Windows has no supported containment boundary for confidential matters. Confirm the installed hook, effective settings and approved host isolation before relying on these controls.</w:t>
       </w:r>
     </w:p>
     <w:p>
@@ -18853,6 +18934,7 @@
       <w:tr>
         <w:trPr>
           <w:tblHeader/>
+          <w:cantSplit/>
         </w:trPr>
         <w:tc>
           <w:tcPr>
@@ -18928,6 +19010,7 @@
       <w:tr>
         <w:trPr>
           <w:tblHeader w:val="false"/>
+          <w:cantSplit/>
         </w:trPr>
         <w:tc>
           <w:tcPr>
@@ -19001,6 +19084,7 @@
       <w:tr>
         <w:trPr>
           <w:tblHeader w:val="false"/>
+          <w:cantSplit/>
         </w:trPr>
         <w:tc>
           <w:tcPr>
@@ -19074,6 +19158,7 @@
       <w:tr>
         <w:trPr>
           <w:tblHeader w:val="false"/>
+          <w:cantSplit/>
         </w:trPr>
         <w:tc>
           <w:tcPr>

</xml_diff>